<commit_message>
chore: finalize unicef submission docs and team additions
</commit_message>
<xml_diff>
--- a/Galeon_UNICEF_PRD.docx
+++ b/Galeon_UNICEF_PRD.docx
@@ -4000,7 +4000,7 @@
           <w:color w:val="1F3A68"/>
           <w:sz w:val="22"/>
         </w:rPr>
-        <w:t xml:space="preserve">Answer: @mateodaza (Mateo Daza, co-founder, technical lead), @CarlosQ96 (Carlos Quintero, co-founder, backend &amp; infrastructure), Fabio Anaya (UNICEF partnership lead, Cartagena On Chain).</w:t>
+        <w:t xml:space="preserve">Answer: @mateodaza (Mateo Daza, Senior Frontend Engineer), @CarlosQ96 (Carlos Quintero, Full Stack / Backend Engineer), Fabio Anaya (Lead of Growth, Cartagena On Chain), Juan David Correa (Lead of Logistics / Project Manager), Juan José Sanfeliú (Lead of Marketing).</w:t>
       </w:r>
     </w:p>
     <w:p>
@@ -4102,7 +4102,7 @@
           <w:color w:val="1F3A68"/>
           <w:sz w:val="22"/>
         </w:rPr>
-        <w:t xml:space="preserve">Answer: 0 external code contributors. Galeon-specific application, integration, stealth, registry, and API code was written by the two founding engineers (Mateo Daza and Carlos Quintero). Privacy Pool circuits and contracts are inherited or adapted from 0xbow (Apache-2.0 upstream). Fabio Anaya (Cartagena On Chain) leads partnership development and UNICEF programme coordination. The protocol has been internally reviewed and we will open external contributions after the month-six public release.</w:t>
+        <w:t xml:space="preserve">Answer: 0 external code contributors. Galeon-specific application, integration, stealth, registry, and API code was written by the two founding engineers (Mateo Daza and Carlos Quintero). Privacy Pool circuits and contracts are inherited or adapted from 0xbow (Apache-2.0 upstream). Operational team for the UNICEF programme: Fabio Anaya leads UNICEF partnership coordination and pilot growth; Juan David Correa manages project execution, milestone tracking, and compliance reporting; Juan José Sanfeliú leads open-source community engagement, developer relations, and partner communications. The protocol has been internally reviewed and we will open external contributions after the month-six public release.</w:t>
       </w:r>
     </w:p>
     <w:p>
@@ -4953,7 +4953,7 @@
           <w:color w:val="1F3A68"/>
           <w:sz w:val="22"/>
         </w:rPr>
-        <w:t xml:space="preserve">Year 1 (funded period): Founders Mateo Daza and Carlos Quintero work full-time on engineering. Fabio Anaya (Cartagena On Chain) leads UNICEF partnership coordination and pilot operations. Q1 of the funded period: engineering hardening (CI, coverage, ERC-20 pool deployment on current chain), audit kickoff, partner discovery. Destination L2 will be confirmed during partner scoping; migration is not a Q1 deliverable. Q2: privacy/compliance readiness (real ASP filtering, audit remediation, DPIA), open-source release, sandbox with partner staff. Q3: controlled pilot (≤50 beneficiaries), multi-language UI, Shipwreck jurisdiction expansion. Q4: pilot expansion to ≤100 beneficiaries, independent usability evaluation, developer docs, sustainability roadmap, WCAG 2.1 AA accessibility audit.</w:t>
+        <w:t xml:space="preserve">Year 1 (funded period): Engineering: Mateo Daza (Frontend) and Carlos Quintero (Backend / Protocol) work full-time. Operational team: Fabio Anaya (Growth, UNICEF partnership coordination), Juan David Correa (Project Manager, milestone tracking and compliance reporting), Juan José Sanfeliú (Marketing, open-source community engagement and developer relations). Q1 of the funded period: engineering hardening (CI, coverage, ERC-20 pool deployment on current chain), audit kickoff, partner discovery. Destination L2 will be confirmed during partner scoping; migration is not a Q1 deliverable. Q2: privacy/compliance readiness (real ASP filtering, audit remediation, DPIA), open-source release, sandbox with partner staff. Q3: controlled pilot (≤50 beneficiaries), multi-language UI, Shipwreck jurisdiction expansion. Q4: pilot expansion to ≤100 beneficiaries, independent usability evaluation, developer docs, sustainability roadmap, WCAG 2.1 AA accessibility audit.</w:t>
       </w:r>
     </w:p>
     <w:p>
@@ -7977,7 +7977,7 @@
           <w:color w:val="1F3A68"/>
           <w:sz w:val="22"/>
         </w:rPr>
-        <w:t xml:space="preserve">Answer: Users interact via Galeon's Next.js web application (mobile-responsive web app). Connection options today: (1) Non-custodial wallets through Reown AppKit / WalletConnect — MetaMask, Rabby, Coinbase Wallet, and mobile wallets (Trust, Rainbow, etc.). (2) Sign-In With Ethereum (SIWE) for session authentication; no email or password is required today. After Privy integration, email-based login will be available; see the data-handling section for email-collection implications. (3) Roadmap (Q1 of the UNICEF-funded period): embedded email-based wallet via Privy, so first-time users with no crypto experience get a wallet abstracted by the frontend, recoverable via email. All transaction signing happens client-side; Galeon never holds user keys.</w:t>
+        <w:t xml:space="preserve">Answer: Users interact via Galeon's Next.js web application (mobile-responsive, mobile-first). Connection options today: (1) Non-custodial wallets through Reown AppKit / WalletConnect — MetaMask, Rabby, Coinbase Wallet, and mobile wallets (Trust, Rainbow, etc.). (2) Sign-In With Ethereum (SIWE) for session authentication; no email or password is required today. (3) Roadmap (Q1 of the funded period): embedded email-based wallet via Privy plus account abstraction. The goal: a beneficiary opens a link, logs in with email, and receives stablecoins — without ever seeing a seed phrase, gas fee, or network-switching prompt. Account abstraction lets the implementing partner sponsor transaction gas where appropriate, batch operations, and provide social/email recovery. Users do not need to know they are using crypto until they hold the stablecoin balance. All transaction signing happens client-side; Galeon never holds user keys.</w:t>
       </w:r>
     </w:p>
     <w:p>

</xml_diff>

<commit_message>
docs: finalize UNICEF submission documents
</commit_message>
<xml_diff>
--- a/Galeon_UNICEF_PRD.docx
+++ b/Galeon_UNICEF_PRD.docx
@@ -608,7 +608,7 @@
                 <w:color w:val="1F3A68"/>
                 <w:sz w:val="20"/>
               </w:rPr>
-              <w:t>Yes. End-to-end live on mainnet: stealth-address payments, ZK Privacy Pool deposits/withdrawals, relayer, PDF compliance reports. ~443 automated tests across the stack (194 contract + 215 backend + 34 stealth library).</w:t>
+              <w:t xml:space="preserve">Yes. End-to-end live on mainnet, with deliberate separation between user-facing simplicity and protocol complexity: beneficiaries see a payment link and a balance; stealth-address generation, ZK proof creation, ASP attestation, and relayer routing happen invisibly. ~443 automated tests across the stack (194 contract + 215 backend + 34 stealth library).</w:t>
             </w:r>
           </w:p>
         </w:tc>
@@ -661,7 +661,7 @@
                 <w:color w:val="1F3A68"/>
                 <w:sz w:val="20"/>
               </w:rPr>
-              <w:t>Yes. Mobile-responsive Next.js frontend with SIWE auth, wallet onboarding, per-port keys, payment links delivered as standard URLs (shareable through any channel the implementing partner uses); Port type metadata supports a 'burner' value for future single-use enforcement (auto-expiry / one-time-use logic is on the roadmap; not yet implemented).</w:t>
+              <w:t xml:space="preserve">Yes. Mobile-first responsive Next.js frontend that hides protocol complexity from end users — users see payment links, balances, and simple actions, not stealth addresses, ZK proofs, or gas mechanics. SIWE auth, wallet onboarding, per-port keys, payment links delivered as standard URLs (shareable through any channel the implementing partner uses); Port type metadata supports a "burner" value for future single-use enforcement (auto-expiry / one-time-use logic is on the roadmap; not yet implemented).</w:t>
             </w:r>
           </w:p>
         </w:tc>
@@ -1697,7 +1697,7 @@
                 <w:color w:val="1F3A68"/>
                 <w:sz w:val="20"/>
               </w:rPr>
-              <w:t xml:space="preserve">Internal engineering hardening informed by founder use and feedback from &lt;10 people (hackathon judges, advisors); preparation for migration to a more cost-efficient L2; published litepaper.</w:t>
+              <w:t>Internal engineering hardening informed by founder use and feedback from &lt;10 people (hackathon judges, advisors); preparation for migration to a more throughput-efficient L2; published litepaper.</w:t>
             </w:r>
           </w:p>
         </w:tc>
@@ -2471,7 +2471,7 @@
           <w:sz w:val="22"/>
           <w:szCs w:val="22"/>
         </w:rPr>
-        <w:t xml:space="preserve">Not Open Source yet. Repository will be made public by month six of the funded period, per UNICEF open-source requirements.</w:t>
+        <w:t xml:space="preserve">Already Open Source. Repository is publicly accessible under permissive licences (MIT for apps and libraries; Apache-2.0 for smart contracts and pool SDK, inherited from 0xbow). Meets UNICEF open-source requirements from the start of the funded period.</w:t>
       </w:r>
     </w:p>
     <w:p>
@@ -3681,7 +3681,7 @@
           <w:color w:val="1F3A68"/>
           <w:sz w:val="22"/>
         </w:rPr>
-        <w:t xml:space="preserve">Answer: Monorepo (Turborepo) at https://github.com/mateodaza/galeon containing: apps/web (Next.js frontend), apps/api (AdonisJS backend), apps/indexer (Ponder blockchain indexer), packages/stealth (EIP-5564 library), packages/contracts (Solidity), packages/pool (Privacy Pool SDK), packages/config, packages/types. The repository is currently private; access for @unicefinnovation will be granted upon request.</w:t>
+        <w:t>Answer: Monorepo (Turborepo) at https://github.com/mateodaza/galeon containing: apps/web (Next.js frontend), apps/api (AdonisJS backend), apps/indexer (Ponder blockchain indexer), packages/stealth (EIP-5564 library), packages/contracts (Solidity), packages/pool (Privacy Pool SDK), packages/config, packages/types. The repository is publicly accessible at the GitHub URL above; UNICEF reviewers can access it directly.</w:t>
       </w:r>
     </w:p>
     <w:p>
@@ -3897,7 +3897,7 @@
           <w:color w:val="1F3A68"/>
           <w:sz w:val="22"/>
         </w:rPr>
-        <w:t xml:space="preserve">Acknowledged: access for @unicefinnovation will be granted before the evaluation period begins.</w:t>
+        <w:t xml:space="preserve">Repository is publicly accessible; @unicefinnovation can access it directly without any grant.</w:t>
       </w:r>
     </w:p>
     <w:p>
@@ -4102,7 +4102,7 @@
           <w:color w:val="1F3A68"/>
           <w:sz w:val="22"/>
         </w:rPr>
-        <w:t xml:space="preserve">Answer: 0 external code contributors. Galeon-specific application, integration, stealth, registry, and API code was written by the two founding engineers (Mateo Daza and Carlos Quintero). Privacy Pool circuits and contracts are inherited or adapted from 0xbow (Apache-2.0 upstream). Operational team for the UNICEF programme: Fabio Anaya leads UNICEF partnership coordination and pilot growth; Juan David Correa manages project execution, milestone tracking, and compliance reporting; Juan José Sanfeliú leads open-source community engagement, developer relations, and partner communications. The protocol has been internally reviewed and we will open external contributions after the month-six public release.</w:t>
+        <w:t xml:space="preserve">Answer: 0 external code contributors. Galeon-specific application, integration, stealth, registry, and API code was written by the two founding engineers (Mateo Daza and Carlos Quintero). Privacy Pool circuits and contracts are inherited or adapted from 0xbow (Apache-2.0 upstream). Operational team for the UNICEF programme: Fabio Anaya leads UNICEF partnership coordination and pilot growth; Juan David Correa manages project execution, milestone tracking, and compliance reporting; Juan José Sanfeliú leads open-source community engagement, developer relations, and partner communications. The protocol has been internally reviewed and the repository is already public; external contributions will be opened after Q2 community-readiness work (CONTRIBUTING.md, code of conduct, governance).</w:t>
       </w:r>
     </w:p>
     <w:p>
@@ -4983,7 +4983,7 @@
           <w:color w:val="1F3A68"/>
           <w:sz w:val="22"/>
         </w:rPr>
-        <w:t xml:space="preserve">Scalability trajectory: Galeon's per-transaction cost is dominated by ZK proof verification gas on L2. Recent and upcoming Ethereum upgrades (increased blob throughput, cheaper L2 data availability) reduce this without any changes to our contracts. Lower-cost L2s offer significantly cheaper proof verification than Mantle, which is one reason for the planned migration.</w:t>
+        <w:t>Scalability trajectory: Galeon's per-transaction proof-verification overhead is dominated by ZK verification gas on L2. Recent and upcoming Ethereum upgrades (increased blob throughput, more efficient L2 data availability) reduce this without any changes to our contracts. Higher-throughput L2s can reduce verification overhead relative to Mantle, which is one reason for the planned migration.</w:t>
       </w:r>
     </w:p>
     <w:p>
@@ -6922,7 +6922,7 @@
           <w:color w:val="1F3A68"/>
           <w:sz w:val="22"/>
         </w:rPr>
-        <w:t xml:space="preserve">Answer: Currently deployed on Mantle Mainnet (chain id 5000), a public, fully open EVM L2. The protocol is EVM-compatible by design — the contracts and circuits work on any EVM chain that exposes the BN254 precompiles (Ethereum mainnet, Arbitrum, Optimism, Base, Polygon zkEVM, Mantle, OP-stack chains). Today the application-level chain config (packages/config) is hardcoded to Mantle (5000) and Mantle Sepolia (5003); adding another chain requires updating the config package and redeploying the contracts. Generalising the config to support multiple chains is on the roadmap; the funded period focuses on cost assessment and chain selection with UNICEF country offices, not migration as a deliverable. We are evaluating migration to a higher-throughput / lower-cost EVM L2 (Arbitrum One, Base, or another OP-stack chain) for humanitarian-scale deployment; the final destination chain will be confirmed jointly with UNICEF country offices during the pilot scoping phase.</w:t>
+        <w:t>Answer: Currently deployed on Mantle Mainnet (chain id 5000), a public, fully open EVM L2. The protocol is EVM-compatible by design — the contracts and circuits work on any EVM chain that exposes the BN254 precompiles (Ethereum mainnet, Arbitrum, Optimism, Base, Polygon zkEVM, Mantle, OP-stack chains). Today the application-level chain config (packages/config) is hardcoded to Mantle (5000) and Mantle Sepolia (5003); adding another chain requires updating the config package and redeploying the contracts. Generalising the config to support multiple chains is on the roadmap; the funded period focuses on performance assessment and chain selection with UNICEF country offices, not migration as a deliverable. We are evaluating migration to a higher-throughput EVM L2 (Arbitrum One, Base, or another OP-stack chain) for humanitarian-scale deployment; the final destination chain will be confirmed jointly with UNICEF country offices during the pilot scoping phase.</w:t>
       </w:r>
     </w:p>
     <w:p>
@@ -7867,7 +7867,7 @@
           <w:color w:val="1F3A68"/>
           <w:sz w:val="22"/>
         </w:rPr>
-        <w:t xml:space="preserve">Answer: Compliance architecture exists at the protocol level: (1) ASP allowlist architecture is in place to prevent illicit funds entering the anonymity set; the live ASP currently auto-approves every deposit (hackathon-stage placeholder) — implementing real screening (sanctions, blocklist, vetted attestation) is the first major Q2 deliverable; (2) Shipwreck tax-compliance reports for US and Colombian jurisdictions today (Spanish-language content exists in the Colombian template; the Q3 i18n work covers UI strings broadly, not Shipwreck report content which is already per-jurisdiction) export individual PDFs for users; (3) verified-balance gating ensures only Port-originated funds (a vetted entry point) can deposit into the pool; (4) ASP can exclude flagged labels without affecting other users' privacy; (5) ragequit mechanism allows users to exit the pool if compelled by legal process. We will engage outside counsel and pursue partner-specific certifications in each pilot jurisdiction.</w:t>
+        <w:t xml:space="preserve">Answer: Compliance architecture exists at the protocol level: (1) ASP allowlist architecture is in place to prevent illicit funds entering the anonymity set; the live ASP currently auto-approves every deposit (hackathon-stage placeholder) — implementing real screening (sanctions list + blocklist + IPFS-published attestation, weekly cadence, operated by Galeon under Cartagena On Chain) is the first major Q2 deliverable. The ASP screens deposit labels (Port-approving addresses), not beneficiary identity or amounts. (2) Shipwreck tax-compliance reports for US and Colombian jurisdictions today (Spanish-language content exists in the Colombian template; the Q3 i18n work covers UI strings broadly, not Shipwreck report content which is already per-jurisdiction) export individual PDFs for users; (3) verified-balance gating ensures only Port-originated funds (a vetted entry point) can deposit into the pool; (4) ASP can exclude flagged labels without affecting other users' privacy; (5) ragequit mechanism provides beneficiary protection — any user whose deposit is excluded from the allowlist (including false-positive screening) retains access to their funds via a public withdrawal back to the original deposit address; no deposited funds are locked. The affected depositor recovers funds through a public ragequit withdrawal to the original deposit address — they may lose private withdrawal access for that deposit, but not access to the funds. A documented appeals process with a 5-business-day SLA is published alongside the ASP policy. We will engage outside counsel and pursue partner-specific certifications in each pilot jurisdiction.</w:t>
       </w:r>
     </w:p>
     <w:p>
@@ -7977,7 +7977,7 @@
           <w:color w:val="1F3A68"/>
           <w:sz w:val="22"/>
         </w:rPr>
-        <w:t xml:space="preserve">Answer: Users interact via Galeon's Next.js web application (mobile-responsive, mobile-first). Connection options today: (1) Non-custodial wallets through Reown AppKit / WalletConnect — MetaMask, Rabby, Coinbase Wallet, and mobile wallets (Trust, Rainbow, etc.). (2) Sign-In With Ethereum (SIWE) for session authentication; no email or password is required today. (3) Roadmap (Q1 of the funded period): embedded email-based wallet via Privy plus account abstraction. The goal: a beneficiary opens a link, logs in with email, and receives stablecoins — without ever seeing a seed phrase, gas fee, or network-switching prompt. Account abstraction lets the implementing partner sponsor transaction gas where appropriate, batch operations, and provide social/email recovery. Users do not need to know they are using crypto until they hold the stablecoin balance. All transaction signing happens client-side; Galeon never holds user keys.</w:t>
+        <w:t xml:space="preserve">Answer: Galeon is designed around a deliberate gap between user experience and protocol complexity. Beneficiaries should be able to receive a payment link, log in with email, and have a stablecoin balance without ever encountering crypto concepts (seed phrases, gas, network selection, signing prompts). Implementation: Next.js mobile-first responsive web application. Connection options today: (1) Non-custodial wallets through Reown AppKit / WalletConnect — MetaMask, Rabby, Coinbase Wallet, and mobile wallets (Trust, Rainbow, etc.). (2) Sign-In With Ethereum (SIWE) for session authentication; no email or password is required today. (3) Roadmap (Q1 of the funded period): embedded email-based wallet via Privy plus account abstraction. Account abstraction lets the implementing partner sponsor transaction gas where appropriate, batch operations, and provide social/email recovery. The end-user experience target: a beneficiary opens a link, logs in with email, and receives stablecoins — without seeing a seed phrase, gas fee, or network-switching prompt. All transaction signing happens client-side; Galeon never holds user keys.</w:t>
       </w:r>
     </w:p>
     <w:p>
@@ -10247,7 +10247,7 @@
           <w:rFonts w:ascii="Consolas" w:hAnsi="Consolas"/>
           <w:sz w:val="18"/>
         </w:rPr>
-        <w:t>1. apps/web — Frontend. Next.js 16, React 19, Tailwind v4, wagmi v3, Reown AppKit for wallet connection. Mobile-responsive web app. Status: complete and live at https://galeon.finance. Open source plan: yes (MIT) on public release. Pages: /setup, /receive, /pay/[portId], /collect, /dashboard, /history, /reports, /verify, /about, /pitch.</w:t>
+        <w:t xml:space="preserve">1. apps/web — Frontend. Next.js 16, React 19, Tailwind v4, wagmi v3, Reown AppKit for wallet connection. Mobile-responsive web app. Status: complete and live at https://galeon.finance. Open source: yes, already published under MIT licence. Pages: /setup, /receive, /pay/[portId], /collect, /dashboard, /history, /reports, /verify, /about, /pitch.</w:t>
       </w:r>
     </w:p>
     <w:p>
@@ -10271,7 +10271,7 @@
           <w:rFonts w:ascii="Consolas" w:hAnsi="Consolas"/>
           <w:sz w:val="18"/>
         </w:rPr>
-        <w:t xml:space="preserve">2. apps/api — Backend. AdonisJS 6 (Node.js, TypeScript), Lucid ORM, PostgreSQL (Railway), Redis for jobs, Transmit (Adonis) for SSE real-time updates, SIWE for auth with JWT refresh tokens. Hosts: ports lifecycle, encrypted viewing keys, Shipwreck PDF generator (PDFKit), relayer service for private pool withdrawals, ASP auto-approve worker. 215 tests passing. Status: complete. Open source plan: yes.</w:t>
+        <w:t xml:space="preserve">2. apps/api — Backend. AdonisJS 6 (Node.js, TypeScript), Lucid ORM, PostgreSQL (Railway), Redis for jobs, Transmit (Adonis) for SSE real-time updates, SIWE for auth with JWT refresh tokens. Hosts: ports lifecycle, encrypted viewing keys, Shipwreck PDF generator (PDFKit), relayer service for private pool withdrawals, ASP auto-approve worker. 215 tests passing. Status: complete. Open source: already published.</w:t>
       </w:r>
     </w:p>
     <w:p>
@@ -10295,7 +10295,7 @@
           <w:rFonts w:ascii="Consolas" w:hAnsi="Consolas"/>
           <w:sz w:val="18"/>
         </w:rPr>
-        <w:t xml:space="preserve">3. apps/indexer — Ponder blockchain indexer. Streams events from GaleonRegistry, ERC5564Announcer and Privacy Pool contracts; exposes a REST API for the frontend to scan announcements and reconstruct the Merkle state tree. Status: complete. Open source plan: yes.</w:t>
+        <w:t xml:space="preserve">3. apps/indexer — Ponder blockchain indexer. Streams events from GaleonRegistry, ERC5564Announcer and Privacy Pool contracts; exposes a REST API for the frontend to scan announcements and reconstruct the Merkle state tree. Status: complete. Open source: already published.</w:t>
       </w:r>
     </w:p>
     <w:p>
@@ -10319,7 +10319,7 @@
           <w:rFonts w:ascii="Consolas" w:hAnsi="Consolas"/>
           <w:sz w:val="18"/>
         </w:rPr>
-        <w:t xml:space="preserve">4. packages/stealth — EIP-5564 / EIP-6538 stealth-address library. @noble/curves 2.0 (secp256k1), @noble/hashes 2.0 (keccak256, HKDF-SHA256). Per-port key derivation using HKDF with port index as salt. 34 tests passing. Status: complete; internally reviewed (external delta-audit scoped for Q1-Q2 of the funded period). Open source plan: yes (MIT).</w:t>
+        <w:t xml:space="preserve">4. packages/stealth — EIP-5564 / EIP-6538 stealth-address library. @noble/curves 2.0 (secp256k1), @noble/hashes 2.0 (keccak256, HKDF-SHA256). Per-port key derivation using HKDF with port index as salt. 34 tests passing. Status: complete; internally reviewed (external delta-audit scoped for Q1-Q2 of the funded period). Open source: already published (MIT).</w:t>
       </w:r>
     </w:p>
     <w:p>
@@ -10343,7 +10343,7 @@
           <w:rFonts w:ascii="Consolas" w:hAnsi="Consolas"/>
           <w:sz w:val="18"/>
         </w:rPr>
-        <w:t>5. packages/pool — Privacy Pool SDK. Groth16 SNARK proof generation (main-thread + web-worker), LeanIMT Merkle tree (@zk-kit/lean-imt), Poseidon hashing (maci-crypto). Inherits ZK circuits from 0xbow privacy-pools-core (Apache-2.0, audited by Oxorio). Status: complete (circuits inherit Oxorio audits performed for 0xbow privacy-pools-core; our contract-level modifications have not yet been independently audited). Open source plan: yes (Apache-2.0, inherited).</w:t>
+        <w:t xml:space="preserve">5. packages/pool — Privacy Pool SDK. Groth16 SNARK proof generation (main-thread + web-worker), LeanIMT Merkle tree (@zk-kit/lean-imt), Poseidon hashing (maci-crypto). Inherits ZK circuits from 0xbow privacy-pools-core (Apache-2.0, audited by Oxorio). Status: complete (circuits inherit Oxorio audits performed for 0xbow privacy-pools-core; our contract-level modifications have not yet been independently audited). Open source: already published (Apache-2.0, inherited).</w:t>
       </w:r>
     </w:p>
     <w:p>
@@ -10367,7 +10367,7 @@
           <w:rFonts w:ascii="Consolas" w:hAnsi="Consolas"/>
           <w:sz w:val="18"/>
         </w:rPr>
-        <w:t xml:space="preserve">6. packages/contracts — Solidity ^0.8.20 (base) / ^0.8.24 (privacy-pool), Hardhat 2.28. Contracts: GaleonRegistry (port + payment + verified-balance ledger), ERC5564Announcer, ERC6538Registry (meta-address) — these are non-upgradeable. GaleonEntrypoint (UUPS), GaleonPrivacyPoolSimple (native, UUPS), GaleonPrivacyPoolComplex (ERC-20, UUPS), WithdrawalVerifier, RagequitVerifier, MergeDepositVerifier — verifiers are non-upgradeable. 194 tests passing. Status: complete, deployed on Mantle Mainnet (addresses listed above). Open source plan: yes (Apache-2.0, inherited from 0xbow upstream).</w:t>
+        <w:t xml:space="preserve">6. packages/contracts — Solidity ^0.8.20 (base) / ^0.8.24 (privacy-pool), Hardhat 2.28. Contracts: GaleonRegistry (port + payment + verified-balance ledger), ERC5564Announcer, ERC6538Registry (meta-address) — these are non-upgradeable. GaleonEntrypoint (UUPS), GaleonPrivacyPoolSimple (native, UUPS), GaleonPrivacyPoolComplex (ERC-20, UUPS), WithdrawalVerifier, RagequitVerifier, MergeDepositVerifier — verifiers are non-upgradeable. 194 tests passing. Status: complete, deployed on Mantle Mainnet (addresses listed above). Open source: already published (Apache-2.0, inherited from 0xbow upstream).</w:t>
       </w:r>
     </w:p>
     <w:p>
@@ -10391,7 +10391,7 @@
           <w:rFonts w:ascii="Consolas" w:hAnsi="Consolas"/>
           <w:sz w:val="18"/>
         </w:rPr>
-        <w:t xml:space="preserve">7. packages/config / packages/types — Shared chain definitions, contract addresses, ABIs, and TypeScript types across all apps. Status: complete. Open source plan: yes.</w:t>
+        <w:t xml:space="preserve">7. packages/config / packages/types — Shared chain definitions, contract addresses, ABIs, and TypeScript types across all apps. Status: complete. Open source: already published.</w:t>
       </w:r>
     </w:p>
     <w:p>

</xml_diff>

<commit_message>
fix: on unicef docs
</commit_message>
<xml_diff>
--- a/Galeon_UNICEF_PRD.docx
+++ b/Galeon_UNICEF_PRD.docx
@@ -4953,7 +4953,7 @@
           <w:color w:val="1F3A68"/>
           <w:sz w:val="22"/>
         </w:rPr>
-        <w:t xml:space="preserve">Year 1 (funded period): Engineering: Mateo Daza (Frontend) and Carlos Quintero (Backend / Protocol) work full-time. Operational team: Fabio Anaya (Growth, UNICEF partnership coordination), Juan David Correa (Project Manager, milestone tracking and compliance reporting), Juan José Sanfeliú (Marketing, open-source community engagement and developer relations). Q1 of the funded period: engineering hardening (CI, coverage, ERC-20 pool deployment on current chain), audit kickoff, partner discovery. Destination L2 will be confirmed during partner scoping; migration is not a Q1 deliverable. Q2: privacy/compliance readiness (real ASP filtering, audit remediation, DPIA), open-source release, sandbox with partner staff. Q3: controlled pilot (≤50 beneficiaries), multi-language UI, Shipwreck jurisdiction expansion. Q4: pilot expansion to ≤100 beneficiaries, independent usability evaluation, developer docs, sustainability roadmap, WCAG 2.1 AA accessibility audit.</w:t>
+        <w:t xml:space="preserve">Year 1 (funded period): Engineering: Mateo Daza (Frontend) and Carlos Quintero (Backend / Protocol) work full-time. Operational team: Fabio Anaya (Growth, UNICEF partnership coordination), Juan David Correa (Project Manager, milestone tracking and compliance reporting), Juan José Sanfeliú (Marketing, open-source community engagement and developer relations). Q1 of the funded period: engineering hardening (CI, coverage, ERC-20 pool deployment on current chain), audit kickoff, partner discovery. Destination L2 will be confirmed during partner scoping; migration is not a Q1 deliverable. Q2: privacy/compliance readiness (real ASP filtering, audit remediation, DPIA), open-source community readiness (repository is already public — focus is on community guides, security review, and UNICEF attribution), sandbox with partner staff. Q3: controlled pilot (≤50 beneficiaries), multi-language UI, Shipwreck jurisdiction expansion. Q4: pilot expansion to ≤100 beneficiaries, independent usability evaluation, developer docs, sustainability roadmap, WCAG 2.1 AA accessibility audit.</w:t>
       </w:r>
     </w:p>
     <w:p>
@@ -4968,7 +4968,7 @@
           <w:color w:val="1F3A68"/>
           <w:sz w:val="22"/>
         </w:rPr>
-        <w:t xml:space="preserve">Year 2: Client-side viewing-key custody (removes the last server-side personal-data analogue). Sustainability model based on partner-supported infrastructure fees (paid by programme sponsors, never deducted from beneficiary entitlements; waived during pilots) and ASP attestation service tiers for organisations needing compliance-grade privacy infrastructure.</w:t>
+        <w:t xml:space="preserve">Year 2: Client-side viewing-key custody (removes the last server-side personal-data analogue). Sustainability beyond the funded period will be explored through partner support arrangements and attestation services for organisations needing compliance-grade privacy infrastructure. No specific post-funding arrangements are committed in this proposal.</w:t>
       </w:r>
     </w:p>
     <w:p>
@@ -7867,7 +7867,7 @@
           <w:color w:val="1F3A68"/>
           <w:sz w:val="22"/>
         </w:rPr>
-        <w:t xml:space="preserve">Answer: Compliance architecture exists at the protocol level: (1) ASP allowlist architecture is in place to prevent illicit funds entering the anonymity set; the live ASP currently auto-approves every deposit (hackathon-stage placeholder) — implementing real screening (sanctions list + blocklist + IPFS-published attestation, weekly cadence, operated by Galeon under Cartagena On Chain) is the first major Q2 deliverable. The ASP screens deposit labels (Port-approving addresses), not beneficiary identity or amounts. (2) Shipwreck tax-compliance reports for US and Colombian jurisdictions today (Spanish-language content exists in the Colombian template; the Q3 i18n work covers UI strings broadly, not Shipwreck report content which is already per-jurisdiction) export individual PDFs for users; (3) verified-balance gating ensures only Port-originated funds (a vetted entry point) can deposit into the pool; (4) ASP can exclude flagged labels without affecting other users' privacy; (5) ragequit mechanism provides beneficiary protection — any user whose deposit is excluded from the allowlist (including false-positive screening) retains access to their funds via a public withdrawal back to the original deposit address; no deposited funds are locked. The affected depositor recovers funds through a public ragequit withdrawal to the original deposit address — they may lose private withdrawal access for that deposit, but not access to the funds. A documented appeals process with a 5-business-day SLA is published alongside the ASP policy. We will engage outside counsel and pursue partner-specific certifications in each pilot jurisdiction.</w:t>
+        <w:t xml:space="preserve">Answer: Compliance architecture exists at the protocol level: (1) ASP allowlist architecture is in place to prevent illicit funds entering the anonymity set; the live ASP currently auto-approves every deposit (hackathon-stage placeholder) — implementing real screening (sanctions list + blocklist + IPFS-published attestation, regular cadence (frequency defined during Q2 design), operated by Galeon under Cartagena On Chain) is the first major Q2 deliverable. The ASP screens deposit labels (Port-approving addresses), not beneficiary identity or amounts. (2) Shipwreck tax-compliance reports for US and Colombian jurisdictions today (Spanish-language content exists in the Colombian template; the Q3 i18n work covers UI strings broadly, not Shipwreck report content which is already per-jurisdiction) export individual PDFs for users; (3) verified-balance gating ensures only Port-originated funds (a vetted entry point) can deposit into the pool; (4) ASP can exclude flagged labels without affecting other users' privacy; (5) ragequit mechanism provides beneficiary protection — any user whose deposit is excluded from the allowlist (including false-positive screening) retains access to their funds via a public withdrawal back to the original deposit address; no deposited funds are locked. The affected depositor recovers funds through a public ragequit withdrawal to the original deposit address — they may lose private withdrawal access for that deposit, but not access to the funds. A documented appeals process is published alongside the ASP policy; the SLA is defined with partner and external counsel before pilots begin. We will engage outside counsel and pursue partner-specific certifications in each pilot jurisdiction.</w:t>
       </w:r>
     </w:p>
     <w:p>
@@ -7977,7 +7977,7 @@
           <w:color w:val="1F3A68"/>
           <w:sz w:val="22"/>
         </w:rPr>
-        <w:t xml:space="preserve">Answer: Galeon is designed around a deliberate gap between user experience and protocol complexity. Beneficiaries should be able to receive a payment link, log in with email, and have a stablecoin balance without ever encountering crypto concepts (seed phrases, gas, network selection, signing prompts). Implementation: Next.js mobile-first responsive web application. Connection options today: (1) Non-custodial wallets through Reown AppKit / WalletConnect — MetaMask, Rabby, Coinbase Wallet, and mobile wallets (Trust, Rainbow, etc.). (2) Sign-In With Ethereum (SIWE) for session authentication; no email or password is required today. (3) Roadmap (Q1 of the funded period): embedded email-based wallet via Privy plus account abstraction. Account abstraction lets the implementing partner sponsor transaction gas where appropriate, batch operations, and provide social/email recovery. The end-user experience target: a beneficiary opens a link, logs in with email, and receives stablecoins — without seeing a seed phrase, gas fee, or network-switching prompt. All transaction signing happens client-side; Galeon never holds user keys.</w:t>
+        <w:t xml:space="preserve">Answer: Galeon is designed around a deliberate gap between user experience and protocol complexity. Beneficiaries should be able to receive a payment link, log in with email, and have a stablecoin balance without ever encountering crypto concepts (seed phrases, gas, network selection, signing prompts). Implementation: Next.js mobile-first responsive web application. Connection options today: (1) Non-custodial wallets through Reown AppKit / WalletConnect — MetaMask, Rabby, Coinbase Wallet, and mobile wallets (Trust, Rainbow, etc.). (2) Sign-In With Ethereum (SIWE) for session authentication; no email or password is required today. (3) Roadmap (Q1 of the funded period): evaluate and implement wallet onboarding and gas-simplification options where supported by the selected provider (Privy or equivalent), so beneficiaries do not need to manage seed phrases or gas fees. The end-user experience target: a beneficiary opens a link, logs in with email, and receives stablecoins — without seeing a seed phrase, gas fee, or network-switching prompt. All transaction signing happens client-side; Galeon never holds user keys.</w:t>
       </w:r>
     </w:p>
     <w:p>

</xml_diff>

<commit_message>
fix: unicef budget totals, embed annex diagrams, fill git answer
</commit_message>
<xml_diff>
--- a/Galeon_UNICEF_PRD.docx
+++ b/Galeon_UNICEF_PRD.docx
@@ -4857,7 +4857,7 @@
           <w:rFonts w:ascii="Calibri" w:eastAsia="Calibri" w:hAnsi="Calibri" w:cs="Calibri"/>
           <w:lang w:val="en-GB"/>
         </w:rPr>
-        <w:t>   </w:t>
+        <w:t xml:space="preserve">Not applicable. Galeon uses git for version control (monorepo at github.com/mateodaza/galeon, hosted on GitHub).</w:t>
       </w:r>
       <w:r>
         <w:rPr>
@@ -7867,7 +7867,7 @@
           <w:color w:val="1F3A68"/>
           <w:sz w:val="22"/>
         </w:rPr>
-        <w:t xml:space="preserve">Answer: Compliance architecture exists at the protocol level: (1) ASP allowlist architecture is in place to prevent illicit funds entering the anonymity set; the live ASP currently auto-approves every deposit (hackathon-stage placeholder) — implementing real screening (sanctions list + blocklist + IPFS-published attestation, regular cadence (frequency defined during Q2 design), operated by Galeon under Cartagena On Chain) is the first major Q2 deliverable. The ASP screens deposit labels (Port-approving addresses), not beneficiary identity or amounts. (2) Shipwreck tax-compliance reports for US and Colombian jurisdictions today (Spanish-language content exists in the Colombian template; the Q3 i18n work covers UI strings broadly, not Shipwreck report content which is already per-jurisdiction) export individual PDFs for users; (3) verified-balance gating ensures only Port-originated funds (a vetted entry point) can deposit into the pool; (4) ASP can exclude flagged labels without affecting other users' privacy; (5) ragequit mechanism provides beneficiary protection — any user whose deposit is excluded from the allowlist (including false-positive screening) retains access to their funds via a public withdrawal back to the original deposit address; no deposited funds are locked. The affected depositor recovers funds through a public ragequit withdrawal to the original deposit address — they may lose private withdrawal access for that deposit, but not access to the funds. A documented appeals process is published alongside the ASP policy; the SLA is defined with partner and external counsel before pilots begin. We will engage outside counsel and pursue partner-specific certifications in each pilot jurisdiction.</w:t>
+        <w:t xml:space="preserve">Answer: Compliance architecture exists at the protocol level: (1) ASP allowlist architecture is in place to prevent illicit funds entering the anonymity set; the live ASP currently auto-approves every deposit (hackathon-stage placeholder) — implementing real screening (sanctions list + blocklist + IPFS-published attestation, regular cadence (frequency defined during Q2 design), operated by Galeon under Cartagena On Chain) is the first major Q2 deliverable. The ASP screens deposit labels (Port-approving addresses), not beneficiary identity or amounts. (2) Shipwreck tax-compliance reports for US and Colombian jurisdictions today (Spanish-language content exists in the Colombian template; the Q3 i18n work covers UI strings broadly, not Shipwreck report content which is already per-jurisdiction) export individual PDFs for users; (3) verified-balance gating ensures only Port-originated funds (a vetted entry point) can deposit into the pool; (4) ASP can exclude flagged labels without affecting other users' privacy; (5) ragequit mechanism provides beneficiary protection — any user whose deposit is excluded from the allowlist (including false-positive screening) retains access to their funds via a public withdrawal back to the original deposit address; no deposited funds are locked. The affected depositor recovers funds through a public ragequit withdrawal to the original deposit address — they may lose private withdrawal access for that deposit, but not access to the funds. A documented appeals process is published alongside the ASP policy; the SLA is defined with partner and external counsel before pilots begin. We will engage outside counsel and complete partner-specific compliance documentation requested for the pilot jurisdiction in each pilot jurisdiction.</w:t>
       </w:r>
     </w:p>
     <w:p>
@@ -9933,93 +9933,42 @@
       </w:r>
     </w:p>
     <w:p>
-      <w:pPr>
-        <w:rPr>
-          <w:rFonts w:ascii="Calibri" w:eastAsia="Calibri" w:hAnsi="Calibri" w:cs="Calibri"/>
-          <w:bCs/>
-          <w:sz w:val="22"/>
-          <w:szCs w:val="22"/>
-          <w:lang w:val="en-GB"/>
-        </w:rPr>
-      </w:pPr>
-      <w:r>
-        <w:rPr>
-          <w:rFonts w:ascii="Calibri" w:eastAsia="Calibri" w:hAnsi="Calibri" w:cs="Calibri"/>
-          <w:b/>
-          <w:i/>
-          <w:sz w:val="22"/>
-          <w:szCs w:val="22"/>
-          <w:lang w:val="en-GB"/>
-        </w:rPr>
-        <w:t xml:space="preserve">PLEASE INSERT HERE: Annex 1: </w:t>
-      </w:r>
-      <w:r>
-        <w:rPr>
-          <w:rFonts w:ascii="Calibri" w:eastAsia="Calibri" w:hAnsi="Calibri" w:cs="Calibri"/>
-          <w:b/>
-          <w:sz w:val="22"/>
-          <w:szCs w:val="22"/>
-          <w:lang w:val="en-GB"/>
-        </w:rPr>
-        <w:t>a diagram of your current tech stack including all components and subsystems, showing their linkages and interactions</w:t>
-      </w:r>
-      <w:r>
-        <w:rPr>
-          <w:rFonts w:ascii="Calibri" w:eastAsia="Calibri" w:hAnsi="Calibri" w:cs="Calibri"/>
-          <w:sz w:val="22"/>
-          <w:szCs w:val="22"/>
-          <w:lang w:val="en-GB"/>
-        </w:rPr>
-        <w:t xml:space="preserve">. A tech stack is a combination of software products and programming languages used. </w:t>
-      </w:r>
-      <w:r>
-        <w:rPr>
-          <w:rFonts w:ascii="Calibri" w:eastAsia="Calibri" w:hAnsi="Calibri" w:cs="Calibri"/>
-          <w:b/>
-          <w:bCs/>
-          <w:sz w:val="22"/>
-          <w:szCs w:val="22"/>
-          <w:lang w:val="en-GB"/>
-        </w:rPr>
-        <w:t>For this diagram, include:</w:t>
-      </w:r>
-      <w:r>
-        <w:rPr>
-          <w:rFonts w:ascii="Calibri" w:eastAsia="Calibri" w:hAnsi="Calibri" w:cs="Calibri"/>
-          <w:sz w:val="22"/>
-          <w:szCs w:val="22"/>
-          <w:lang w:val="en-GB"/>
-        </w:rPr>
-        <w:t xml:space="preserve"> both </w:t>
-      </w:r>
-      <w:r>
-        <w:rPr>
-          <w:rFonts w:ascii="Calibri" w:eastAsia="Calibri" w:hAnsi="Calibri" w:cs="Calibri"/>
-          <w:sz w:val="22"/>
-          <w:szCs w:val="22"/>
-          <w:lang w:val="en-GB"/>
-        </w:rPr>
-        <w:t>client-side</w:t>
-      </w:r>
-      <w:r>
-        <w:rPr>
-          <w:rFonts w:ascii="Calibri" w:eastAsia="Calibri" w:hAnsi="Calibri" w:cs="Calibri"/>
-          <w:sz w:val="22"/>
-          <w:szCs w:val="22"/>
-          <w:lang w:val="en-GB"/>
-        </w:rPr>
-        <w:t xml:space="preserve"> and server side documentation if relevant, tools used for front-end and back-end systems (including databases), and any meta-layers</w:t>
-      </w:r>
-      <w:r>
-        <w:rPr>
-          <w:rFonts w:ascii="Arial" w:eastAsia="Arial" w:hAnsi="Arial" w:cs="Arial"/>
-          <w:bCs/>
-          <w:sz w:val="26"/>
-          <w:szCs w:val="26"/>
-          <w:highlight w:val="white"/>
-          <w:lang w:val="en-GB"/>
-        </w:rPr>
-        <w:t>.</w:t>
+      <w:r>
+        <w:drawing>
+          <wp:inline distT="0" distB="0" distL="0" distR="0">
+            <wp:extent cx="5486400" cy="4134786"/>
+            <wp:effectExtent l="0" t="0" r="0" b="0"/>
+            <wp:docPr id="25" name="Galeon Tech Stack Diagram"/>
+            <wp:cNvGraphicFramePr>
+              <a:graphicFrameLocks noChangeAspect="1"/>
+            </wp:cNvGraphicFramePr>
+            <a:graphic>
+              <a:graphicData uri="http://schemas.openxmlformats.org/drawingml/2006/picture">
+                <pic:pic>
+                  <pic:nvPicPr>
+                    <pic:cNvPr id="25" name="Galeon Tech Stack Diagram"/>
+                    <pic:cNvPicPr/>
+                  </pic:nvPicPr>
+                  <pic:blipFill>
+                    <a:blip r:embed="rId25"/>
+                    <a:stretch>
+                      <a:fillRect/>
+                    </a:stretch>
+                  </pic:blipFill>
+                  <pic:spPr>
+                    <a:xfrm>
+                      <a:off x="0" y="0"/>
+                      <a:ext cx="5486400" cy="4134786"/>
+                    </a:xfrm>
+                    <a:prstGeom prst="rect">
+                      <a:avLst/>
+                    </a:prstGeom>
+                  </pic:spPr>
+                </pic:pic>
+              </a:graphicData>
+            </a:graphic>
+          </wp:inline>
+        </w:drawing>
       </w:r>
     </w:p>
     <w:p>
@@ -10031,7 +9980,7 @@
           <w:rFonts w:ascii="Consolas" w:hAnsi="Consolas"/>
           <w:sz w:val="18"/>
         </w:rPr>
-        <w:t xml:space="preserve">ANNEX 1 — GALEON TECH STACK (Written Description)</w:t>
+        <w:t xml:space="preserve">COMPONENT DESCRIPTIONS</w:t>
       </w:r>
     </w:p>
     <w:p>
@@ -10055,7 +10004,7 @@
           <w:rFonts w:ascii="Consolas" w:hAnsi="Consolas"/>
           <w:sz w:val="18"/>
         </w:rPr>
-        <w:t xml:space="preserve">TEXTUAL DIAGRAM (top = client; bottom = chain):</w:t>
+        <w:t xml:space="preserve">1. apps/web — Frontend. Next.js 16, React 19, Tailwind v4, wagmi v3, Reown AppKit for wallet connection. Mobile-responsive web app. Status: complete and live at https://galeon.finance. Open source: yes, already published under MIT licence. Pages: /setup, /receive, /pay/[portId], /collect, /dashboard, /history, /reports, /verify, /about, /pitch.</w:t>
       </w:r>
     </w:p>
     <w:p>
@@ -10079,7 +10028,7 @@
           <w:rFonts w:ascii="Consolas" w:hAnsi="Consolas"/>
           <w:sz w:val="18"/>
         </w:rPr>
-        <w:t xml:space="preserve">[ User (web / mobile browser) ]</w:t>
+        <w:t xml:space="preserve">2. apps/api — Backend. AdonisJS 6 (Node.js, TypeScript), Lucid ORM, PostgreSQL (Railway), Redis for jobs, Transmit (Adonis) for SSE real-time updates, SIWE for auth with JWT refresh tokens. Hosts: ports lifecycle, encrypted viewing keys, Shipwreck PDF generator (PDFKit), relayer service for private pool withdrawals, ASP auto-approve worker. 215 tests passing. Status: complete. Open source: already published.</w:t>
       </w:r>
     </w:p>
     <w:p>
@@ -10091,7 +10040,7 @@
           <w:rFonts w:ascii="Consolas" w:hAnsi="Consolas"/>
           <w:sz w:val="18"/>
         </w:rPr>
-        <w:t xml:space="preserve">        ↓  HTTPS / WalletConnect</w:t>
+        <w:t xml:space="preserve"> </w:t>
       </w:r>
     </w:p>
     <w:p>
@@ -10103,7 +10052,7 @@
           <w:rFonts w:ascii="Consolas" w:hAnsi="Consolas"/>
           <w:sz w:val="18"/>
         </w:rPr>
-        <w:t xml:space="preserve">[ apps/web — Next.js 16 + React 19 + Tailwind v4 + wagmi v3 + Reown AppKit ]</w:t>
+        <w:t xml:space="preserve">3. apps/indexer — Ponder blockchain indexer. Streams events from GaleonRegistry, ERC5564Announcer and Privacy Pool contracts; exposes a REST API for the frontend to scan announcements and reconstruct the Merkle state tree. Status: complete. Open source: already published.</w:t>
       </w:r>
     </w:p>
     <w:p>
@@ -10115,7 +10064,7 @@
           <w:rFonts w:ascii="Consolas" w:hAnsi="Consolas"/>
           <w:sz w:val="18"/>
         </w:rPr>
-        <w:t xml:space="preserve">        ↓  REST (SIWE JWT)              ↓  Direct JSON-RPC (signed tx)</w:t>
+        <w:t xml:space="preserve"> </w:t>
       </w:r>
     </w:p>
     <w:p>
@@ -10127,7 +10076,7 @@
           <w:rFonts w:ascii="Consolas" w:hAnsi="Consolas"/>
           <w:sz w:val="18"/>
         </w:rPr>
-        <w:t xml:space="preserve">[ apps/api — AdonisJS 6 + Lucid ORM + Transmit SSE + PostgreSQL (Railway) ]</w:t>
+        <w:t xml:space="preserve">4. packages/stealth — EIP-5564 / EIP-6538 stealth-address library. @noble/curves 2.0 (secp256k1), @noble/hashes 2.0 (keccak256, HKDF-SHA256). Per-port key derivation using HKDF with port index as salt. 34 tests passing. Status: complete; internally reviewed (external delta-audit scoped for Q1-Q2 of the funded period). Open source: already published (MIT).</w:t>
       </w:r>
     </w:p>
     <w:p>
@@ -10139,7 +10088,7 @@
           <w:rFonts w:ascii="Consolas" w:hAnsi="Consolas"/>
           <w:sz w:val="18"/>
         </w:rPr>
-        <w:t xml:space="preserve">        ↓  reads indexed events         ↓  submits private withdrawals</w:t>
+        <w:t xml:space="preserve"> </w:t>
       </w:r>
     </w:p>
     <w:p>
@@ -10151,7 +10100,7 @@
           <w:rFonts w:ascii="Consolas" w:hAnsi="Consolas"/>
           <w:sz w:val="18"/>
         </w:rPr>
-        <w:t xml:space="preserve">[ apps/indexer — Ponder + Viem ]      [ Relayer service (apps/api) ]</w:t>
+        <w:t xml:space="preserve">5. packages/pool — Privacy Pool SDK. Groth16 SNARK proof generation (main-thread + web-worker), LeanIMT Merkle tree (@zk-kit/lean-imt), Poseidon hashing (maci-crypto). Inherits ZK circuits from 0xbow privacy-pools-core (Apache-2.0, audited by Oxorio). Status: complete (circuits inherit Oxorio audits performed for 0xbow privacy-pools-core; our contract-level modifications have not yet been independently audited). Open source: already published (Apache-2.0, inherited).</w:t>
       </w:r>
     </w:p>
     <w:p>
@@ -10163,7 +10112,7 @@
           <w:rFonts w:ascii="Consolas" w:hAnsi="Consolas"/>
           <w:sz w:val="18"/>
         </w:rPr>
-        <w:t xml:space="preserve">        ↓                                ↓</w:t>
+        <w:t xml:space="preserve"> </w:t>
       </w:r>
     </w:p>
     <w:p>
@@ -10175,7 +10124,7 @@
           <w:rFonts w:ascii="Consolas" w:hAnsi="Consolas"/>
           <w:sz w:val="18"/>
         </w:rPr>
-        <w:t xml:space="preserve">[ packages/stealth — EIP-5564/6538 (Noble curves &amp; hashes) ]</w:t>
+        <w:t xml:space="preserve">6. packages/contracts — Solidity ^0.8.20 (base) / ^0.8.24 (privacy-pool), Hardhat 2.28. Contracts: GaleonRegistry (port + payment + verified-balance ledger), ERC5564Announcer, ERC6538Registry (meta-address) — these are non-upgradeable. GaleonEntrypoint (UUPS), GaleonPrivacyPoolSimple (native, UUPS), GaleonPrivacyPoolComplex (ERC-20, UUPS), WithdrawalVerifier, RagequitVerifier, MergeDepositVerifier — verifiers are non-upgradeable. 194 tests passing. Status: complete, deployed on Mantle Mainnet (addresses listed above). Open source: already published (Apache-2.0, inherited from 0xbow upstream).</w:t>
       </w:r>
     </w:p>
     <w:p>
@@ -10187,7 +10136,7 @@
           <w:rFonts w:ascii="Consolas" w:hAnsi="Consolas"/>
           <w:sz w:val="18"/>
         </w:rPr>
-        <w:t xml:space="preserve">[ packages/pool — Privacy Pool SDK (Groth16 prover, LeanIMT, Poseidon) ]</w:t>
+        <w:t xml:space="preserve"> </w:t>
       </w:r>
     </w:p>
     <w:p>
@@ -10199,7 +10148,7 @@
           <w:rFonts w:ascii="Consolas" w:hAnsi="Consolas"/>
           <w:sz w:val="18"/>
         </w:rPr>
-        <w:t xml:space="preserve">[ packages/contracts — Solidity ^0.8.20/^0.8.24 (Hardhat) ] → deployed on Mantle Mainnet (and any EVM L2)</w:t>
+        <w:t xml:space="preserve">7. packages/config / packages/types — Shared chain definitions, contract addresses, ABIs, and TypeScript types across all apps. Status: complete. Open source: already published.</w:t>
       </w:r>
     </w:p>
     <w:p>
@@ -10223,7 +10172,7 @@
           <w:rFonts w:ascii="Consolas" w:hAnsi="Consolas"/>
           <w:sz w:val="18"/>
         </w:rPr>
-        <w:t xml:space="preserve">COMPONENT DESCRIPTIONS</w:t>
+        <w:t xml:space="preserve">8. Infrastructure — Railway (PostgreSQL + Redis + apps/api hosting), Vercel (apps/web hosting), GitHub Actions (CI/CD), Husky + Prettier + ESLint (code quality). All commodity infrastructure with no lock-in.</w:t>
       </w:r>
     </w:p>
     <w:p>
@@ -10247,7 +10196,7 @@
           <w:rFonts w:ascii="Consolas" w:hAnsi="Consolas"/>
           <w:sz w:val="18"/>
         </w:rPr>
-        <w:t xml:space="preserve">1. apps/web — Frontend. Next.js 16, React 19, Tailwind v4, wagmi v3, Reown AppKit for wallet connection. Mobile-responsive web app. Status: complete and live at https://galeon.finance. Open source: yes, already published under MIT licence. Pages: /setup, /receive, /pay/[portId], /collect, /dashboard, /history, /reports, /verify, /about, /pitch.</w:t>
+        <w:t xml:space="preserve">DEVELOPMENT STATUS SUMMARY</w:t>
       </w:r>
     </w:p>
     <w:p>
@@ -10259,7 +10208,7 @@
           <w:rFonts w:ascii="Consolas" w:hAnsi="Consolas"/>
           <w:sz w:val="18"/>
         </w:rPr>
-        <w:t xml:space="preserve"> </w:t>
+        <w:t xml:space="preserve">- Live in production on EVM mainnet: stealth addresses, Privacy Pool v1, relayer, ASP, Shipwreck reports.</w:t>
       </w:r>
     </w:p>
     <w:p>
@@ -10271,198 +10220,6 @@
           <w:rFonts w:ascii="Consolas" w:hAnsi="Consolas"/>
           <w:sz w:val="18"/>
         </w:rPr>
-        <w:t xml:space="preserve">2. apps/api — Backend. AdonisJS 6 (Node.js, TypeScript), Lucid ORM, PostgreSQL (Railway), Redis for jobs, Transmit (Adonis) for SSE real-time updates, SIWE for auth with JWT refresh tokens. Hosts: ports lifecycle, encrypted viewing keys, Shipwreck PDF generator (PDFKit), relayer service for private pool withdrawals, ASP auto-approve worker. 215 tests passing. Status: complete. Open source: already published.</w:t>
-      </w:r>
-    </w:p>
-    <w:p>
-      <w:pPr>
-        <w:spacing w:after="80"/>
-      </w:pPr>
-      <w:r>
-        <w:rPr>
-          <w:rFonts w:ascii="Consolas" w:hAnsi="Consolas"/>
-          <w:sz w:val="18"/>
-        </w:rPr>
-        <w:t xml:space="preserve"> </w:t>
-      </w:r>
-    </w:p>
-    <w:p>
-      <w:pPr>
-        <w:spacing w:after="80"/>
-      </w:pPr>
-      <w:r>
-        <w:rPr>
-          <w:rFonts w:ascii="Consolas" w:hAnsi="Consolas"/>
-          <w:sz w:val="18"/>
-        </w:rPr>
-        <w:t xml:space="preserve">3. apps/indexer — Ponder blockchain indexer. Streams events from GaleonRegistry, ERC5564Announcer and Privacy Pool contracts; exposes a REST API for the frontend to scan announcements and reconstruct the Merkle state tree. Status: complete. Open source: already published.</w:t>
-      </w:r>
-    </w:p>
-    <w:p>
-      <w:pPr>
-        <w:spacing w:after="80"/>
-      </w:pPr>
-      <w:r>
-        <w:rPr>
-          <w:rFonts w:ascii="Consolas" w:hAnsi="Consolas"/>
-          <w:sz w:val="18"/>
-        </w:rPr>
-        <w:t xml:space="preserve"> </w:t>
-      </w:r>
-    </w:p>
-    <w:p>
-      <w:pPr>
-        <w:spacing w:after="80"/>
-      </w:pPr>
-      <w:r>
-        <w:rPr>
-          <w:rFonts w:ascii="Consolas" w:hAnsi="Consolas"/>
-          <w:sz w:val="18"/>
-        </w:rPr>
-        <w:t xml:space="preserve">4. packages/stealth — EIP-5564 / EIP-6538 stealth-address library. @noble/curves 2.0 (secp256k1), @noble/hashes 2.0 (keccak256, HKDF-SHA256). Per-port key derivation using HKDF with port index as salt. 34 tests passing. Status: complete; internally reviewed (external delta-audit scoped for Q1-Q2 of the funded period). Open source: already published (MIT).</w:t>
-      </w:r>
-    </w:p>
-    <w:p>
-      <w:pPr>
-        <w:spacing w:after="80"/>
-      </w:pPr>
-      <w:r>
-        <w:rPr>
-          <w:rFonts w:ascii="Consolas" w:hAnsi="Consolas"/>
-          <w:sz w:val="18"/>
-        </w:rPr>
-        <w:t xml:space="preserve"> </w:t>
-      </w:r>
-    </w:p>
-    <w:p>
-      <w:pPr>
-        <w:spacing w:after="80"/>
-      </w:pPr>
-      <w:r>
-        <w:rPr>
-          <w:rFonts w:ascii="Consolas" w:hAnsi="Consolas"/>
-          <w:sz w:val="18"/>
-        </w:rPr>
-        <w:t xml:space="preserve">5. packages/pool — Privacy Pool SDK. Groth16 SNARK proof generation (main-thread + web-worker), LeanIMT Merkle tree (@zk-kit/lean-imt), Poseidon hashing (maci-crypto). Inherits ZK circuits from 0xbow privacy-pools-core (Apache-2.0, audited by Oxorio). Status: complete (circuits inherit Oxorio audits performed for 0xbow privacy-pools-core; our contract-level modifications have not yet been independently audited). Open source: already published (Apache-2.0, inherited).</w:t>
-      </w:r>
-    </w:p>
-    <w:p>
-      <w:pPr>
-        <w:spacing w:after="80"/>
-      </w:pPr>
-      <w:r>
-        <w:rPr>
-          <w:rFonts w:ascii="Consolas" w:hAnsi="Consolas"/>
-          <w:sz w:val="18"/>
-        </w:rPr>
-        <w:t xml:space="preserve"> </w:t>
-      </w:r>
-    </w:p>
-    <w:p>
-      <w:pPr>
-        <w:spacing w:after="80"/>
-      </w:pPr>
-      <w:r>
-        <w:rPr>
-          <w:rFonts w:ascii="Consolas" w:hAnsi="Consolas"/>
-          <w:sz w:val="18"/>
-        </w:rPr>
-        <w:t xml:space="preserve">6. packages/contracts — Solidity ^0.8.20 (base) / ^0.8.24 (privacy-pool), Hardhat 2.28. Contracts: GaleonRegistry (port + payment + verified-balance ledger), ERC5564Announcer, ERC6538Registry (meta-address) — these are non-upgradeable. GaleonEntrypoint (UUPS), GaleonPrivacyPoolSimple (native, UUPS), GaleonPrivacyPoolComplex (ERC-20, UUPS), WithdrawalVerifier, RagequitVerifier, MergeDepositVerifier — verifiers are non-upgradeable. 194 tests passing. Status: complete, deployed on Mantle Mainnet (addresses listed above). Open source: already published (Apache-2.0, inherited from 0xbow upstream).</w:t>
-      </w:r>
-    </w:p>
-    <w:p>
-      <w:pPr>
-        <w:spacing w:after="80"/>
-      </w:pPr>
-      <w:r>
-        <w:rPr>
-          <w:rFonts w:ascii="Consolas" w:hAnsi="Consolas"/>
-          <w:sz w:val="18"/>
-        </w:rPr>
-        <w:t xml:space="preserve"> </w:t>
-      </w:r>
-    </w:p>
-    <w:p>
-      <w:pPr>
-        <w:spacing w:after="80"/>
-      </w:pPr>
-      <w:r>
-        <w:rPr>
-          <w:rFonts w:ascii="Consolas" w:hAnsi="Consolas"/>
-          <w:sz w:val="18"/>
-        </w:rPr>
-        <w:t xml:space="preserve">7. packages/config / packages/types — Shared chain definitions, contract addresses, ABIs, and TypeScript types across all apps. Status: complete. Open source: already published.</w:t>
-      </w:r>
-    </w:p>
-    <w:p>
-      <w:pPr>
-        <w:spacing w:after="80"/>
-      </w:pPr>
-      <w:r>
-        <w:rPr>
-          <w:rFonts w:ascii="Consolas" w:hAnsi="Consolas"/>
-          <w:sz w:val="18"/>
-        </w:rPr>
-        <w:t xml:space="preserve"> </w:t>
-      </w:r>
-    </w:p>
-    <w:p>
-      <w:pPr>
-        <w:spacing w:after="80"/>
-      </w:pPr>
-      <w:r>
-        <w:rPr>
-          <w:rFonts w:ascii="Consolas" w:hAnsi="Consolas"/>
-          <w:sz w:val="18"/>
-        </w:rPr>
-        <w:t xml:space="preserve">8. Infrastructure — Railway (PostgreSQL + Redis + apps/api hosting), Vercel (apps/web hosting), GitHub Actions (CI/CD), Husky + Prettier + ESLint (code quality). All commodity infrastructure with no lock-in.</w:t>
-      </w:r>
-    </w:p>
-    <w:p>
-      <w:pPr>
-        <w:spacing w:after="80"/>
-      </w:pPr>
-      <w:r>
-        <w:rPr>
-          <w:rFonts w:ascii="Consolas" w:hAnsi="Consolas"/>
-          <w:sz w:val="18"/>
-        </w:rPr>
-        <w:t xml:space="preserve"> </w:t>
-      </w:r>
-    </w:p>
-    <w:p>
-      <w:pPr>
-        <w:spacing w:after="80"/>
-      </w:pPr>
-      <w:r>
-        <w:rPr>
-          <w:rFonts w:ascii="Consolas" w:hAnsi="Consolas"/>
-          <w:sz w:val="18"/>
-        </w:rPr>
-        <w:t xml:space="preserve">DEVELOPMENT STATUS SUMMARY</w:t>
-      </w:r>
-    </w:p>
-    <w:p>
-      <w:pPr>
-        <w:spacing w:after="80"/>
-      </w:pPr>
-      <w:r>
-        <w:rPr>
-          <w:rFonts w:ascii="Consolas" w:hAnsi="Consolas"/>
-          <w:sz w:val="18"/>
-        </w:rPr>
-        <w:t xml:space="preserve">- Live in production on EVM mainnet: stealth addresses, Privacy Pool v1, relayer, ASP, Shipwreck reports.</w:t>
-      </w:r>
-    </w:p>
-    <w:p>
-      <w:pPr>
-        <w:spacing w:after="80"/>
-      </w:pPr>
-      <w:r>
-        <w:rPr>
-          <w:rFonts w:ascii="Consolas" w:hAnsi="Consolas"/>
-          <w:sz w:val="18"/>
-        </w:rPr>
         <w:t xml:space="preserve">- In progress: Independent security audit. Planned (not in current funded scope): account-model Privacy Pool v2, client-side viewing keys, multi-chain deployment.</w:t>
       </w:r>
     </w:p>
@@ -10894,135 +10651,42 @@
       </w:r>
     </w:p>
     <w:p>
-      <w:pPr>
-        <w:spacing w:after="80"/>
-      </w:pPr>
-      <w:r>
-        <w:rPr>
-          <w:rFonts w:ascii="Consolas" w:hAnsi="Consolas"/>
-          <w:sz w:val="18"/>
-        </w:rPr>
-        <w:t xml:space="preserve">ANNEX 2 — DATA FLOW DIAGRAM (Written Description)</w:t>
-      </w:r>
-    </w:p>
-    <w:p>
-      <w:pPr>
-        <w:spacing w:after="80"/>
-      </w:pPr>
-      <w:r>
-        <w:rPr>
-          <w:rFonts w:ascii="Consolas" w:hAnsi="Consolas"/>
-          <w:sz w:val="18"/>
-        </w:rPr>
-        <w:t xml:space="preserve"> </w:t>
-      </w:r>
-    </w:p>
-    <w:p>
-      <w:pPr>
-        <w:spacing w:after="80"/>
-      </w:pPr>
-      <w:r>
-        <w:rPr>
-          <w:rFonts w:ascii="Consolas" w:hAnsi="Consolas"/>
-          <w:sz w:val="18"/>
-        </w:rPr>
-        <w:t xml:space="preserve">TEXTUAL DIAGRAM:</w:t>
-      </w:r>
-    </w:p>
-    <w:p>
-      <w:pPr>
-        <w:spacing w:after="80"/>
-      </w:pPr>
-      <w:r>
-        <w:rPr>
-          <w:rFonts w:ascii="Consolas" w:hAnsi="Consolas"/>
-          <w:sz w:val="18"/>
-        </w:rPr>
-        <w:t xml:space="preserve"> </w:t>
-      </w:r>
-    </w:p>
-    <w:p>
-      <w:pPr>
-        <w:spacing w:after="80"/>
-      </w:pPr>
-      <w:r>
-        <w:rPr>
-          <w:rFonts w:ascii="Consolas" w:hAnsi="Consolas"/>
-          <w:sz w:val="18"/>
-        </w:rPr>
-        <w:t xml:space="preserve">[ User wallet ]  → (1) SIWE signature →  [ apps/api ]  → issues JWT</w:t>
-      </w:r>
-    </w:p>
-    <w:p>
-      <w:pPr>
-        <w:spacing w:after="80"/>
-      </w:pPr>
-      <w:r>
-        <w:rPr>
-          <w:rFonts w:ascii="Consolas" w:hAnsi="Consolas"/>
-          <w:sz w:val="18"/>
-        </w:rPr>
-        <w:t xml:space="preserve">[ User wallet ]  → (2) Port creation tx →  [ Chain: GaleonRegistry ]  → indexer ingests event → apps/api stores Port + encrypted viewing key</w:t>
-      </w:r>
-    </w:p>
-    <w:p>
-      <w:pPr>
-        <w:spacing w:after="80"/>
-      </w:pPr>
-      <w:r>
-        <w:rPr>
-          <w:rFonts w:ascii="Consolas" w:hAnsi="Consolas"/>
-          <w:sz w:val="18"/>
-        </w:rPr>
-        <w:t xml:space="preserve">[ Payer wallet ] → (3) Payment tx to stealth address →  [ Chain: GaleonRegistry + Announcer ] → indexer → frontend scans with viewing key + view tag → user sees incoming payment</w:t>
-      </w:r>
-    </w:p>
-    <w:p>
-      <w:pPr>
-        <w:spacing w:after="80"/>
-      </w:pPr>
-      <w:r>
-        <w:rPr>
-          <w:rFonts w:ascii="Consolas" w:hAnsi="Consolas"/>
-          <w:sz w:val="18"/>
-        </w:rPr>
-        <w:t xml:space="preserve">[ User wallet ]  → (4) Pool deposit tx (Poseidon commitment) →  [ Chain: GaleonEntrypoint + PrivacyPool ] → indexer → ASP worker approves label → ASP Merkle root published on-chain</w:t>
-      </w:r>
-    </w:p>
-    <w:p>
-      <w:pPr>
-        <w:spacing w:after="80"/>
-      </w:pPr>
-      <w:r>
-        <w:rPr>
-          <w:rFonts w:ascii="Consolas" w:hAnsi="Consolas"/>
-          <w:sz w:val="18"/>
-        </w:rPr>
-        <w:t xml:space="preserve">[ User frontend ] → (5) Generate Groth16 proof CLIENT-SIDE → POST to relayer →  Relayer broadcasts withdrawal tx →  Recipient receives funds, no on-chain link to depositor</w:t>
-      </w:r>
-    </w:p>
-    <w:p>
-      <w:pPr>
-        <w:spacing w:after="80"/>
-      </w:pPr>
-      <w:r>
-        <w:rPr>
-          <w:rFonts w:ascii="Consolas" w:hAnsi="Consolas"/>
-          <w:sz w:val="18"/>
-        </w:rPr>
-        <w:t xml:space="preserve">[ User frontend ] → (6) Request Shipwreck report → apps/api compiles port history + on-chain data → returns PDF to user; PDF is never stored</w:t>
-      </w:r>
-    </w:p>
-    <w:p>
-      <w:pPr>
-        <w:spacing w:after="80"/>
-      </w:pPr>
-      <w:r>
-        <w:rPr>
-          <w:rFonts w:ascii="Consolas" w:hAnsi="Consolas"/>
-          <w:sz w:val="18"/>
-        </w:rPr>
-        <w:t xml:space="preserve"> </w:t>
+      <w:r>
+        <w:drawing>
+          <wp:inline distT="0" distB="0" distL="0" distR="0">
+            <wp:extent cx="5486400" cy="5034196"/>
+            <wp:effectExtent l="0" t="0" r="0" b="0"/>
+            <wp:docPr id="26" name="Galeon Data Flow Diagram"/>
+            <wp:cNvGraphicFramePr>
+              <a:graphicFrameLocks noChangeAspect="1"/>
+            </wp:cNvGraphicFramePr>
+            <a:graphic>
+              <a:graphicData uri="http://schemas.openxmlformats.org/drawingml/2006/picture">
+                <pic:pic>
+                  <pic:nvPicPr>
+                    <pic:cNvPr id="26" name="Galeon Data Flow Diagram"/>
+                    <pic:cNvPicPr/>
+                  </pic:nvPicPr>
+                  <pic:blipFill>
+                    <a:blip r:embed="rId26"/>
+                    <a:stretch>
+                      <a:fillRect/>
+                    </a:stretch>
+                  </pic:blipFill>
+                  <pic:spPr>
+                    <a:xfrm>
+                      <a:off x="0" y="0"/>
+                      <a:ext cx="5486400" cy="5034196"/>
+                    </a:xfrm>
+                    <a:prstGeom prst="rect">
+                      <a:avLst/>
+                    </a:prstGeom>
+                  </pic:spPr>
+                </pic:pic>
+              </a:graphicData>
+            </a:graphic>
+          </wp:inline>
+        </w:drawing>
       </w:r>
     </w:p>
     <w:p>

</xml_diff>

<commit_message>
fix: unicef docs final polish
</commit_message>
<xml_diff>
--- a/Galeon_UNICEF_PRD.docx
+++ b/Galeon_UNICEF_PRD.docx
@@ -7867,7 +7867,7 @@
           <w:color w:val="1F3A68"/>
           <w:sz w:val="22"/>
         </w:rPr>
-        <w:t xml:space="preserve">Answer: Compliance architecture exists at the protocol level: (1) ASP allowlist architecture is in place to prevent illicit funds entering the anonymity set; the live ASP currently auto-approves every deposit (hackathon-stage placeholder) — implementing real screening (sanctions list + blocklist + IPFS-published attestation, regular cadence (frequency defined during Q2 design), operated by Galeon under Cartagena On Chain) is the first major Q2 deliverable. The ASP screens deposit labels (Port-approving addresses), not beneficiary identity or amounts. (2) Shipwreck tax-compliance reports for US and Colombian jurisdictions today (Spanish-language content exists in the Colombian template; the Q3 i18n work covers UI strings broadly, not Shipwreck report content which is already per-jurisdiction) export individual PDFs for users; (3) verified-balance gating ensures only Port-originated funds (a vetted entry point) can deposit into the pool; (4) ASP can exclude flagged labels without affecting other users' privacy; (5) ragequit mechanism provides beneficiary protection — any user whose deposit is excluded from the allowlist (including false-positive screening) retains access to their funds via a public withdrawal back to the original deposit address; no deposited funds are locked. The affected depositor recovers funds through a public ragequit withdrawal to the original deposit address — they may lose private withdrawal access for that deposit, but not access to the funds. A documented appeals process is published alongside the ASP policy; the SLA is defined with partner and external counsel before pilots begin. We will engage outside counsel and complete partner-specific compliance documentation requested for the pilot jurisdiction in each pilot jurisdiction.</w:t>
+        <w:t xml:space="preserve">Answer: Compliance architecture exists at the protocol level: (1) ASP allowlist architecture is in place to prevent illicit funds entering the anonymity set; the live ASP currently auto-approves every deposit (hackathon-stage placeholder) — implementing real screening (sanctions list + blocklist + IPFS-published attestation, regular cadence (frequency defined during Q2 design), operated by Galeon under Cartagena On Chain) is the first major Q2 deliverable. The ASP screens deposit labels (Port-approving addresses), not beneficiary identity or amounts. (2) Shipwreck tax-compliance reports for US and Colombian jurisdictions today (Spanish-language content exists in the Colombian template; the Q3 i18n work covers UI strings broadly, not Shipwreck report content which is already per-jurisdiction) export individual PDFs for users; (3) verified-balance gating ensures only Port-originated funds (a vetted entry point) can deposit into the pool; (4) ASP can exclude flagged labels without affecting other users' privacy; (5) ragequit mechanism provides beneficiary protection — any user whose deposit is excluded from the allowlist (including false-positive screening) retains access to their funds via a public withdrawal back to the original deposit address; no deposited funds are locked. The affected depositor recovers funds through a public ragequit withdrawal to the original deposit address — they may lose private withdrawal access for that deposit, but not access to the funds. A documented appeals process is published alongside the ASP policy; the SLA is defined with partner and external counsel before pilots begin. We will engage outside counsel and complete partner-specific compliance documentation requested for each pilot jurisdiction before pilots begin.</w:t>
       </w:r>
     </w:p>
     <w:p>
@@ -10930,26 +10930,7 @@
           <w:szCs w:val="22"/>
           <w:lang w:val="en-GB"/>
         </w:rPr>
-        <w:t>PLEASE INSERT HERE: Annex 3:</w:t>
-      </w:r>
-      <w:r>
-        <w:rPr>
-          <w:rFonts w:ascii="Calibri" w:eastAsia="Calibri" w:hAnsi="Calibri" w:cs="Calibri"/>
-          <w:b/>
-          <w:sz w:val="22"/>
-          <w:szCs w:val="22"/>
-          <w:lang w:val="en-GB"/>
-        </w:rPr>
-        <w:t xml:space="preserve"> a content/curriculum map diagram (max 1 page), including the general organization of the content, rough relational hierarchy.</w:t>
-      </w:r>
-      <w:r>
-        <w:rPr>
-          <w:rFonts w:ascii="Calibri" w:eastAsia="Calibri" w:hAnsi="Calibri" w:cs="Calibri"/>
-          <w:sz w:val="22"/>
-          <w:szCs w:val="22"/>
-          <w:lang w:val="en-GB"/>
-        </w:rPr>
-        <w:t xml:space="preserve"> Be sure to give details at the lowest level of granularity of your content. </w:t>
+        <w:t xml:space="preserve">Not applicable. Galeon is software infrastructure and does not include curriculum, media, or educational content components.</w:t>
       </w:r>
     </w:p>
     <w:p>
@@ -11033,44 +11014,7 @@
           <w:szCs w:val="22"/>
           <w:lang w:val="en-GB"/>
         </w:rPr>
-        <w:t xml:space="preserve">PLEASE INSERT HERE: Annex 4: </w:t>
-      </w:r>
-      <w:r>
-        <w:rPr>
-          <w:rFonts w:ascii="Calibri" w:eastAsia="Calibri" w:hAnsi="Calibri" w:cs="Calibri"/>
-          <w:b/>
-          <w:sz w:val="22"/>
-          <w:szCs w:val="22"/>
-          <w:lang w:val="en-GB"/>
-        </w:rPr>
-        <w:t xml:space="preserve">a sample of the content you have created (at the end of this template Annex 4) and/or plan to create (copy/paste at the end of this form in the appropriate place). </w:t>
-      </w:r>
-      <w:r>
-        <w:rPr>
-          <w:rFonts w:ascii="Calibri" w:eastAsia="Calibri" w:hAnsi="Calibri" w:cs="Calibri"/>
-          <w:sz w:val="22"/>
-          <w:szCs w:val="22"/>
-          <w:lang w:val="en-GB"/>
-        </w:rPr>
-        <w:t xml:space="preserve">The sample should cover one piece, </w:t>
-      </w:r>
-      <w:r>
-        <w:rPr>
-          <w:rFonts w:ascii="Calibri" w:eastAsia="Calibri" w:hAnsi="Calibri" w:cs="Calibri"/>
-          <w:sz w:val="22"/>
-          <w:szCs w:val="22"/>
-          <w:lang w:val="en-GB"/>
-        </w:rPr>
-        <w:t>i.e.</w:t>
-      </w:r>
-      <w:r>
-        <w:rPr>
-          <w:rFonts w:ascii="Calibri" w:eastAsia="Calibri" w:hAnsi="Calibri" w:cs="Calibri"/>
-          <w:sz w:val="22"/>
-          <w:szCs w:val="22"/>
-          <w:lang w:val="en-GB"/>
-        </w:rPr>
-        <w:t xml:space="preserve"> one video, one pdf, one set of exercises etc.</w:t>
+        <w:t xml:space="preserve">Not applicable. Galeon is software infrastructure and does not include curriculum, media, or educational content components.</w:t>
       </w:r>
     </w:p>
     <w:p>

</xml_diff>

<commit_message>
fix: reformat on doc
</commit_message>
<xml_diff>
--- a/Galeon_UNICEF_PRD.docx
+++ b/Galeon_UNICEF_PRD.docx
@@ -7782,13 +7782,15 @@
         <w:ind w:left="200"/>
       </w:pPr>
       <w:r>
-        <w:rPr>
-          <w:rFonts w:ascii="Calibri" w:hAnsi="Calibri"/>
-          <w:i/>
-          <w:color w:val="1F3A68"/>
-          <w:sz w:val="22"/>
-        </w:rPr>
-        <w:t xml:space="preserve">Answer: FATF, R.15 Virtual Assets &amp; VASPs: https://www.fatf-gafi.org/en/publications/Fatfrecommendations/Guidance-rba-virtual-assets-2021.html. FinCEN (US) virtual currency guidance: https://www.fincen.gov/resources/statutes-and-regulations/guidance/application-fincens-regulations-persons-administering. EU MiCA Regulation (2023/1114): https://www.esma.europa.eu/esmas-activities/digital-finance-and-innovation/markets-crypto-assets-regulation-mica. Colombia UIAF circulars on VASPs: https://www.uiaf.gov.co/. We will engage local counsel in each pilot jurisdiction.</w:t>
+        <w:t xml:space="preserve">Answer: FATF, R.15 Virtual Assets &amp; VASPs: https://www.fatf-gafi.org/en/publications/Fatfrecommendations/Guidance-rba-virtual-assets-2021.html</w:t>
+        <w:br/>
+        <w:t xml:space="preserve">FinCEN (US) virtual currency guidance: https://www.fincen.gov/resources/statutes-regulations/guidance/application-fincens-regulations-persons-administering</w:t>
+        <w:br/>
+        <w:t xml:space="preserve">EU MiCA Regulation (2023/1114): https://www.esma.europa.eu/esmas-activities/digital-finance-and-innovation/markets-crypto-assets-regulation-mica</w:t>
+        <w:br/>
+        <w:t xml:space="preserve">Colombia UIAF circulars on VASPs: https://www.uiaf.gov.co/</w:t>
+        <w:br/>
+        <w:t xml:space="preserve">We will engage local counsel in each pilot jurisdiction.</w:t>
       </w:r>
     </w:p>
     <w:p>

</xml_diff>